<commit_message>
fb measure: pleading line numbers (params.pleading_lines) dropped before lines are merged, and a line's baseline from its own words' glyphs; cand proposed-order docx date blank as typst's 18 underscores; XENG-003 green on cand proposed-order docx (fb-595.88)
Co-Authored-By: Claude Opus 5.5 <noreply@anthropic.com>
Gate: fb-595-88-a1 d4792daf87f1c08fe9fb2a3bfbd6aaacdf6896c9
</commit_message>
<xml_diff>
--- a/courts/ninth-circuit/california/federal/northern-district/proposed-order/usage/OUTPUT-proposed-order-4.docx
+++ b/courts/ninth-circuit/california/federal/northern-district/proposed-order/usage/OUTPUT-proposed-order-4.docx
@@ -490,7 +490,7 @@
               <w:jc w:val="left"/>
             </w:pPr>
             <w:r>
-              <w:t xml:space="preserve">Dated: ____________________</w:t>
+              <w:t xml:space="preserve">Dated: __________________</w:t>
             </w:r>
           </w:p>
         </w:tc>
@@ -1192,10 +1192,10 @@
   <w:docDefaults>
     <w:rPrDefault>
       <w:rPr>
-        <w:rFonts w:ascii="Times New Roman" w:cs="Times New Roman" w:eastAsia="Times New Roman" w:hAnsi="Times New Roman"/>
+        <w:rFonts w:ascii="Times New Roman" w:hAnsi="Times New Roman" w:eastAsia="Times New Roman" w:cs="Times New Roman"/>
         <w:sz w:val="24"/>
         <w:szCs w:val="24"/>
-        <w:lang w:bidi="ar-SA" w:eastAsia="en-US" w:val="en-US"/>
+        <w:lang w:val="en-US" w:eastAsia="zh-CN" w:bidi="ar-SA"/>
       </w:rPr>
     </w:rPrDefault>
     <w:pPrDefault>
@@ -1205,36 +1205,36 @@
       </w:pPr>
     </w:pPrDefault>
   </w:docDefaults>
-  <w:latentStyles w:count="276" w:defLockedState="0" w:defQFormat="0" w:defSemiHidden="0" w:defUIPriority="0" w:defUnhideWhenUsed="0"/>
-  <w:style w:default="1" w:styleId="Normal" w:type="paragraph">
+  <w:latentStyles w:defLockedState="0" w:defUIPriority="0" w:defSemiHidden="0" w:defUnhideWhenUsed="0" w:defQFormat="0" w:count="276"/>
+  <w:style w:type="paragraph" w:default="1" w:styleId="Normal">
     <w:name w:val="Normal"/>
     <w:qFormat/>
   </w:style>
-  <w:style w:styleId="BodyText" w:type="paragraph">
+  <w:style w:type="paragraph" w:styleId="BodyText">
     <w:name w:val="Body Text"/>
     <w:basedOn w:val="Normal"/>
     <w:link w:val="BodyTextChar"/>
     <w:qFormat/>
     <w:pPr>
-      <w:spacing w:after="0" w:before="0" w:line="480" w:lineRule="exact"/>
+      <w:spacing w:before="0" w:after="0" w:line="480" w:lineRule="exact"/>
       <w:ind w:firstLine="720"/>
     </w:pPr>
   </w:style>
-  <w:style w:customStyle="1" w:styleId="FirstParagraph" w:type="paragraph">
+  <w:style w:type="paragraph" w:customStyle="1" w:styleId="FirstParagraph">
     <w:name w:val="First Paragraph"/>
     <w:basedOn w:val="BodyText"/>
     <w:next w:val="BodyText"/>
     <w:qFormat/>
   </w:style>
-  <w:style w:customStyle="1" w:styleId="Compact" w:type="paragraph">
+  <w:style w:type="paragraph" w:customStyle="1" w:styleId="Compact">
     <w:name w:val="Compact"/>
     <w:basedOn w:val="BodyText"/>
     <w:qFormat/>
     <w:pPr>
-      <w:spacing w:after="36" w:before="36"/>
-    </w:pPr>
-  </w:style>
-  <w:style w:styleId="Title" w:type="paragraph">
+      <w:spacing w:before="36" w:after="36"/>
+    </w:pPr>
+  </w:style>
+  <w:style w:type="paragraph" w:styleId="Title">
     <w:name w:val="Title"/>
     <w:basedOn w:val="Normal"/>
     <w:next w:val="BodyText"/>
@@ -1248,24 +1248,24 @@
       <w:jc w:val="center"/>
     </w:pPr>
     <w:rPr>
-      <w:rFonts w:asciiTheme="majorHAnsi" w:cstheme="majorBidi" w:eastAsiaTheme="majorEastAsia" w:hAnsiTheme="majorHAnsi"/>
+      <w:rFonts w:asciiTheme="majorHAnsi" w:eastAsiaTheme="majorEastAsia" w:hAnsiTheme="majorHAnsi" w:cstheme="majorBidi"/>
       <w:sz w:val="56"/>
       <w:szCs w:val="56"/>
     </w:rPr>
   </w:style>
-  <w:style w:customStyle="1" w:styleId="TitleChar" w:type="character">
+  <w:style w:type="character" w:customStyle="1" w:styleId="TitleChar">
     <w:name w:val="Title Char"/>
     <w:basedOn w:val="DefaultParagraphFont"/>
     <w:link w:val="Title"/>
     <w:uiPriority w:val="10"/>
     <w:rsid w:val="00A10FD9"/>
     <w:rPr>
-      <w:rFonts w:asciiTheme="majorHAnsi" w:cstheme="majorBidi" w:eastAsiaTheme="majorEastAsia" w:hAnsiTheme="majorHAnsi"/>
+      <w:rFonts w:asciiTheme="majorHAnsi" w:eastAsiaTheme="majorEastAsia" w:hAnsiTheme="majorHAnsi" w:cstheme="majorBidi"/>
       <w:sz w:val="56"/>
       <w:szCs w:val="56"/>
     </w:rPr>
   </w:style>
-  <w:style w:styleId="Subtitle" w:type="paragraph">
+  <w:style w:type="paragraph" w:styleId="Subtitle">
     <w:name w:val="Subtitle"/>
     <w:basedOn w:val="Title"/>
     <w:next w:val="BodyText"/>
@@ -1279,27 +1279,27 @@
       </w:numPr>
     </w:pPr>
     <w:rPr>
-      <w:rFonts w:cstheme="majorBidi" w:eastAsiaTheme="majorEastAsia"/>
+      <w:rFonts w:eastAsiaTheme="majorEastAsia" w:cstheme="majorBidi"/>
       <w:spacing w:val="15"/>
       <w:sz w:val="28"/>
       <w:szCs w:val="28"/>
     </w:rPr>
   </w:style>
-  <w:style w:customStyle="1" w:styleId="SubtitleChar" w:type="character">
+  <w:style w:type="character" w:customStyle="1" w:styleId="SubtitleChar">
     <w:name w:val="Subtitle Char"/>
     <w:basedOn w:val="DefaultParagraphFont"/>
     <w:link w:val="Subtitle"/>
     <w:uiPriority w:val="11"/>
     <w:rsid w:val="00A10FD9"/>
     <w:rPr>
-      <w:rFonts w:cstheme="majorBidi" w:eastAsiaTheme="majorEastAsia"/>
-      <w:color w:themeColor="text1" w:themeTint="A6" w:val="595959"/>
+      <w:rFonts w:eastAsiaTheme="majorEastAsia" w:cstheme="majorBidi"/>
+      <w:color w:val="595959" w:themeColor="text1" w:themeTint="A6"/>
       <w:spacing w:val="15"/>
       <w:sz w:val="28"/>
       <w:szCs w:val="28"/>
     </w:rPr>
   </w:style>
-  <w:style w:customStyle="1" w:styleId="Author" w:type="paragraph">
+  <w:style w:type="paragraph" w:customStyle="1" w:styleId="Author">
     <w:name w:val="Author"/>
     <w:basedOn w:val="Title"/>
     <w:next w:val="BodyText"/>
@@ -1313,7 +1313,7 @@
       <w:szCs w:val="24"/>
     </w:rPr>
   </w:style>
-  <w:style w:styleId="Date" w:type="paragraph">
+  <w:style w:type="paragraph" w:styleId="Date">
     <w:name w:val="Date"/>
     <w:basedOn w:val="Title"/>
     <w:next w:val="BodyText"/>
@@ -1327,7 +1327,7 @@
       <w:szCs w:val="24"/>
     </w:rPr>
   </w:style>
-  <w:style w:customStyle="1" w:styleId="AbstractTitle" w:type="paragraph">
+  <w:style w:type="paragraph" w:customStyle="1" w:styleId="AbstractTitle">
     <w:name w:val="Abstract Title"/>
     <w:basedOn w:val="Normal"/>
     <w:next w:val="Abstract"/>
@@ -1335,7 +1335,7 @@
     <w:pPr>
       <w:keepNext/>
       <w:keepLines/>
-      <w:spacing w:after="0" w:before="300"/>
+      <w:spacing w:before="300" w:after="0"/>
       <w:jc w:val="center"/>
     </w:pPr>
     <w:rPr>
@@ -1344,7 +1344,7 @@
       <w:szCs w:val="20"/>
     </w:rPr>
   </w:style>
-  <w:style w:customStyle="1" w:styleId="Abstract" w:type="paragraph">
+  <w:style w:type="paragraph" w:customStyle="1" w:styleId="Abstract">
     <w:name w:val="Abstract"/>
     <w:basedOn w:val="Normal"/>
     <w:next w:val="BodyText"/>
@@ -1352,14 +1352,14 @@
     <w:pPr>
       <w:keepNext/>
       <w:keepLines/>
-      <w:spacing w:after="300" w:before="100"/>
+      <w:spacing w:before="100" w:after="300"/>
     </w:pPr>
     <w:rPr>
       <w:sz w:val="20"/>
       <w:szCs w:val="20"/>
     </w:rPr>
   </w:style>
-  <w:style w:styleId="Bibliography" w:type="paragraph">
+  <w:style w:type="paragraph" w:styleId="Bibliography">
     <w:name w:val="Bibliography"/>
     <w:basedOn w:val="Normal"/>
     <w:next w:val="Bibliography"/>
@@ -1367,7 +1367,7 @@
     <w:pPr/>
     <w:rPr/>
   </w:style>
-  <w:style w:styleId="Heading1" w:type="paragraph">
+  <w:style w:type="paragraph" w:styleId="Heading1">
     <w:name w:val="heading 1"/>
     <w:basedOn w:val="Normal"/>
     <w:next w:val="BodyText"/>
@@ -1378,13 +1378,13 @@
     <w:pPr>
       <w:keepNext/>
       <w:keepLines/>
-      <w:spacing w:after="240" w:before="240" w:line="240" w:lineRule="exact"/>
+      <w:spacing w:before="240" w:after="240" w:line="240" w:lineRule="exact"/>
       <w:ind w:firstLine="0"/>
       <w:jc w:val="center"/>
       <w:outlineLvl w:val="0"/>
     </w:pPr>
     <w:rPr>
-      <w:rFonts w:ascii="Times New Roman" w:cs="Times New Roman" w:eastAsia="Times New Roman" w:hAnsi="Times New Roman"/>
+      <w:rFonts w:ascii="Times New Roman" w:hAnsi="Times New Roman" w:eastAsia="Times New Roman" w:cs="Times New Roman"/>
       <w:b/>
       <w:bCs/>
       <w:caps/>
@@ -1393,7 +1393,7 @@
       <w:szCs w:val="24"/>
     </w:rPr>
   </w:style>
-  <w:style w:styleId="Heading2" w:type="paragraph">
+  <w:style w:type="paragraph" w:styleId="Heading2">
     <w:name w:val="heading 2"/>
     <w:basedOn w:val="Normal"/>
     <w:next w:val="BodyText"/>
@@ -1406,12 +1406,12 @@
     <w:pPr>
       <w:keepNext/>
       <w:keepLines/>
-      <w:spacing w:after="240" w:before="240" w:line="240" w:lineRule="exact"/>
+      <w:spacing w:before="240" w:after="240" w:line="240" w:lineRule="exact"/>
       <w:ind w:firstLine="0"/>
       <w:outlineLvl w:val="1"/>
     </w:pPr>
     <w:rPr>
-      <w:rFonts w:ascii="Times New Roman" w:cs="Times New Roman" w:eastAsia="Times New Roman" w:hAnsi="Times New Roman"/>
+      <w:rFonts w:ascii="Times New Roman" w:hAnsi="Times New Roman" w:eastAsia="Times New Roman" w:cs="Times New Roman"/>
       <w:b/>
       <w:bCs/>
       <w:color w:val="000000"/>
@@ -1419,7 +1419,7 @@
       <w:szCs w:val="24"/>
     </w:rPr>
   </w:style>
-  <w:style w:styleId="Heading3" w:type="paragraph">
+  <w:style w:type="paragraph" w:styleId="Heading3">
     <w:name w:val="heading 3"/>
     <w:basedOn w:val="Normal"/>
     <w:next w:val="BodyText"/>
@@ -1432,12 +1432,12 @@
     <w:pPr>
       <w:keepNext/>
       <w:keepLines/>
-      <w:spacing w:after="240" w:before="240" w:line="240" w:lineRule="exact"/>
+      <w:spacing w:before="240" w:after="240" w:line="240" w:lineRule="exact"/>
       <w:ind w:firstLine="0"/>
       <w:outlineLvl w:val="2"/>
     </w:pPr>
     <w:rPr>
-      <w:rFonts w:ascii="Times New Roman" w:cs="Times New Roman" w:eastAsia="Times New Roman" w:hAnsi="Times New Roman"/>
+      <w:rFonts w:ascii="Times New Roman" w:hAnsi="Times New Roman" w:eastAsia="Times New Roman" w:cs="Times New Roman"/>
       <w:b/>
       <w:bCs/>
       <w:color w:val="000000"/>
@@ -1445,7 +1445,7 @@
       <w:szCs w:val="24"/>
     </w:rPr>
   </w:style>
-  <w:style w:styleId="Heading4" w:type="paragraph">
+  <w:style w:type="paragraph" w:styleId="Heading4">
     <w:name w:val="heading 4"/>
     <w:basedOn w:val="Normal"/>
     <w:next w:val="BodyText"/>
@@ -1458,12 +1458,12 @@
     <w:pPr>
       <w:keepNext/>
       <w:keepLines/>
-      <w:spacing w:after="240" w:before="240" w:line="240" w:lineRule="exact"/>
+      <w:spacing w:before="240" w:after="240" w:line="240" w:lineRule="exact"/>
       <w:ind w:firstLine="0"/>
       <w:outlineLvl w:val="3"/>
     </w:pPr>
     <w:rPr>
-      <w:rFonts w:ascii="Times New Roman" w:cs="Times New Roman" w:eastAsia="Times New Roman" w:hAnsi="Times New Roman"/>
+      <w:rFonts w:ascii="Times New Roman" w:hAnsi="Times New Roman" w:eastAsia="Times New Roman" w:cs="Times New Roman"/>
       <w:b/>
       <w:bCs/>
       <w:i/>
@@ -1472,7 +1472,7 @@
       <w:szCs w:val="24"/>
     </w:rPr>
   </w:style>
-  <w:style w:styleId="Heading5" w:type="paragraph">
+  <w:style w:type="paragraph" w:styleId="Heading5">
     <w:name w:val="heading 5"/>
     <w:basedOn w:val="Normal"/>
     <w:next w:val="BodyText"/>
@@ -1485,12 +1485,12 @@
     <w:pPr>
       <w:keepNext/>
       <w:keepLines/>
-      <w:spacing w:after="240" w:before="240" w:line="240" w:lineRule="exact"/>
+      <w:spacing w:before="240" w:after="240" w:line="240" w:lineRule="exact"/>
       <w:ind w:firstLine="0"/>
       <w:outlineLvl w:val="4"/>
     </w:pPr>
     <w:rPr>
-      <w:rFonts w:ascii="Times New Roman" w:cs="Times New Roman" w:eastAsia="Times New Roman" w:hAnsi="Times New Roman"/>
+      <w:rFonts w:ascii="Times New Roman" w:hAnsi="Times New Roman" w:eastAsia="Times New Roman" w:cs="Times New Roman"/>
       <w:b/>
       <w:bCs/>
       <w:i/>
@@ -1499,7 +1499,7 @@
       <w:szCs w:val="24"/>
     </w:rPr>
   </w:style>
-  <w:style w:styleId="Heading6" w:type="paragraph">
+  <w:style w:type="paragraph" w:styleId="Heading6">
     <w:name w:val="heading 6"/>
     <w:basedOn w:val="Normal"/>
     <w:next w:val="BodyText"/>
@@ -1512,17 +1512,17 @@
     <w:pPr>
       <w:keepNext/>
       <w:keepLines/>
-      <w:spacing w:after="0" w:before="40"/>
+      <w:spacing w:before="40" w:after="0"/>
       <w:outlineLvl w:val="5"/>
     </w:pPr>
     <w:rPr>
-      <w:rFonts w:cstheme="majorBidi" w:eastAsiaTheme="majorEastAsia"/>
+      <w:rFonts w:eastAsiaTheme="majorEastAsia" w:cstheme="majorBidi"/>
       <w:i/>
       <w:iCs/>
-      <w:color w:themeColor="text1" w:themeTint="A6" w:val="595959"/>
-    </w:rPr>
-  </w:style>
-  <w:style w:styleId="Heading7" w:type="paragraph">
+      <w:color w:val="595959" w:themeColor="text1" w:themeTint="A6"/>
+    </w:rPr>
+  </w:style>
+  <w:style w:type="paragraph" w:styleId="Heading7">
     <w:name w:val="heading 7"/>
     <w:basedOn w:val="Normal"/>
     <w:next w:val="BodyText"/>
@@ -1535,15 +1535,15 @@
     <w:pPr>
       <w:keepNext/>
       <w:keepLines/>
-      <w:spacing w:after="0" w:before="40"/>
+      <w:spacing w:before="40" w:after="0"/>
       <w:outlineLvl w:val="6"/>
     </w:pPr>
     <w:rPr>
-      <w:rFonts w:cstheme="majorBidi" w:eastAsiaTheme="majorEastAsia"/>
-      <w:color w:themeColor="text1" w:themeTint="A6" w:val="595959"/>
-    </w:rPr>
-  </w:style>
-  <w:style w:styleId="Heading8" w:type="paragraph">
+      <w:rFonts w:eastAsiaTheme="majorEastAsia" w:cstheme="majorBidi"/>
+      <w:color w:val="595959" w:themeColor="text1" w:themeTint="A6"/>
+    </w:rPr>
+  </w:style>
+  <w:style w:type="paragraph" w:styleId="Heading8">
     <w:name w:val="heading 8"/>
     <w:basedOn w:val="Normal"/>
     <w:next w:val="BodyText"/>
@@ -1560,13 +1560,13 @@
       <w:outlineLvl w:val="7"/>
     </w:pPr>
     <w:rPr>
-      <w:rFonts w:cstheme="majorBidi" w:eastAsiaTheme="majorEastAsia"/>
+      <w:rFonts w:eastAsiaTheme="majorEastAsia" w:cstheme="majorBidi"/>
       <w:i/>
       <w:iCs/>
-      <w:color w:themeColor="text1" w:themeTint="D8" w:val="272727"/>
-    </w:rPr>
-  </w:style>
-  <w:style w:styleId="Heading9" w:type="paragraph">
+      <w:color w:val="272727" w:themeColor="text1" w:themeTint="D8"/>
+    </w:rPr>
+  </w:style>
+  <w:style w:type="paragraph" w:styleId="Heading9">
     <w:name w:val="heading 9"/>
     <w:basedOn w:val="Normal"/>
     <w:next w:val="BodyText"/>
@@ -1583,24 +1583,24 @@
       <w:outlineLvl w:val="8"/>
     </w:pPr>
     <w:rPr>
-      <w:rFonts w:cstheme="majorBidi" w:eastAsiaTheme="majorEastAsia"/>
-      <w:color w:themeColor="text1" w:themeTint="D8" w:val="272727"/>
-    </w:rPr>
-  </w:style>
-  <w:style w:customStyle="1" w:styleId="Heading1Char" w:type="character">
+      <w:rFonts w:eastAsiaTheme="majorEastAsia" w:cstheme="majorBidi"/>
+      <w:color w:val="272727" w:themeColor="text1" w:themeTint="D8"/>
+    </w:rPr>
+  </w:style>
+  <w:style w:type="character" w:customStyle="1" w:styleId="Heading1Char">
     <w:name w:val="Heading 1 Char"/>
     <w:basedOn w:val="DefaultParagraphFont"/>
     <w:link w:val="Heading1"/>
     <w:uiPriority w:val="9"/>
     <w:rsid w:val="00A10FD9"/>
     <w:rPr>
-      <w:rFonts w:asciiTheme="majorHAnsi" w:cstheme="majorBidi" w:eastAsiaTheme="majorEastAsia" w:hAnsiTheme="majorHAnsi"/>
-      <w:color w:themeColor="accent1" w:themeShade="BF" w:val="0F4761"/>
+      <w:rFonts w:asciiTheme="majorHAnsi" w:eastAsiaTheme="majorEastAsia" w:hAnsiTheme="majorHAnsi" w:cstheme="majorBidi"/>
+      <w:color w:val="0F4761" w:themeColor="accent1" w:themeShade="BF"/>
       <w:sz w:val="40"/>
       <w:szCs w:val="40"/>
     </w:rPr>
   </w:style>
-  <w:style w:customStyle="1" w:styleId="Heading2Char" w:type="character">
+  <w:style w:type="character" w:customStyle="1" w:styleId="Heading2Char">
     <w:name w:val="Heading 2 Char"/>
     <w:basedOn w:val="DefaultParagraphFont"/>
     <w:link w:val="Heading2"/>
@@ -1608,13 +1608,13 @@
     <w:semiHidden/>
     <w:rsid w:val="00A10FD9"/>
     <w:rPr>
-      <w:rFonts w:asciiTheme="majorHAnsi" w:cstheme="majorBidi" w:eastAsiaTheme="majorEastAsia" w:hAnsiTheme="majorHAnsi"/>
-      <w:color w:themeColor="accent1" w:themeShade="BF" w:val="0F4761"/>
+      <w:rFonts w:asciiTheme="majorHAnsi" w:eastAsiaTheme="majorEastAsia" w:hAnsiTheme="majorHAnsi" w:cstheme="majorBidi"/>
+      <w:color w:val="0F4761" w:themeColor="accent1" w:themeShade="BF"/>
       <w:sz w:val="32"/>
       <w:szCs w:val="32"/>
     </w:rPr>
   </w:style>
-  <w:style w:customStyle="1" w:styleId="Heading3Char" w:type="character">
+  <w:style w:type="character" w:customStyle="1" w:styleId="Heading3Char">
     <w:name w:val="Heading 3 Char"/>
     <w:basedOn w:val="DefaultParagraphFont"/>
     <w:link w:val="Heading3"/>
@@ -1622,13 +1622,13 @@
     <w:semiHidden/>
     <w:rsid w:val="00A10FD9"/>
     <w:rPr>
-      <w:rFonts w:cstheme="majorBidi" w:eastAsiaTheme="majorEastAsia"/>
-      <w:color w:themeColor="accent1" w:themeShade="BF" w:val="0F4761"/>
+      <w:rFonts w:eastAsiaTheme="majorEastAsia" w:cstheme="majorBidi"/>
+      <w:color w:val="0F4761" w:themeColor="accent1" w:themeShade="BF"/>
       <w:sz w:val="28"/>
       <w:szCs w:val="28"/>
     </w:rPr>
   </w:style>
-  <w:style w:customStyle="1" w:styleId="Heading4Char" w:type="character">
+  <w:style w:type="character" w:customStyle="1" w:styleId="Heading4Char">
     <w:name w:val="Heading 4 Char"/>
     <w:basedOn w:val="DefaultParagraphFont"/>
     <w:link w:val="Heading4"/>
@@ -1636,13 +1636,13 @@
     <w:semiHidden/>
     <w:rsid w:val="00A10FD9"/>
     <w:rPr>
-      <w:rFonts w:cstheme="majorBidi" w:eastAsiaTheme="majorEastAsia"/>
+      <w:rFonts w:eastAsiaTheme="majorEastAsia" w:cstheme="majorBidi"/>
       <w:i/>
       <w:iCs/>
-      <w:color w:themeColor="accent1" w:themeShade="BF" w:val="0F4761"/>
-    </w:rPr>
-  </w:style>
-  <w:style w:customStyle="1" w:styleId="Heading5Char" w:type="character">
+      <w:color w:val="0F4761" w:themeColor="accent1" w:themeShade="BF"/>
+    </w:rPr>
+  </w:style>
+  <w:style w:type="character" w:customStyle="1" w:styleId="Heading5Char">
     <w:name w:val="Heading 5 Char"/>
     <w:basedOn w:val="DefaultParagraphFont"/>
     <w:link w:val="Heading5"/>
@@ -1650,11 +1650,11 @@
     <w:semiHidden/>
     <w:rsid w:val="00A10FD9"/>
     <w:rPr>
-      <w:rFonts w:cstheme="majorBidi" w:eastAsiaTheme="majorEastAsia"/>
-      <w:color w:themeColor="accent1" w:themeShade="BF" w:val="0F4761"/>
-    </w:rPr>
-  </w:style>
-  <w:style w:customStyle="1" w:styleId="Heading6Char" w:type="character">
+      <w:rFonts w:eastAsiaTheme="majorEastAsia" w:cstheme="majorBidi"/>
+      <w:color w:val="0F4761" w:themeColor="accent1" w:themeShade="BF"/>
+    </w:rPr>
+  </w:style>
+  <w:style w:type="character" w:customStyle="1" w:styleId="Heading6Char">
     <w:name w:val="Heading 6 Char"/>
     <w:basedOn w:val="DefaultParagraphFont"/>
     <w:link w:val="Heading6"/>
@@ -1662,13 +1662,13 @@
     <w:semiHidden/>
     <w:rsid w:val="00A10FD9"/>
     <w:rPr>
-      <w:rFonts w:cstheme="majorBidi" w:eastAsiaTheme="majorEastAsia"/>
+      <w:rFonts w:eastAsiaTheme="majorEastAsia" w:cstheme="majorBidi"/>
       <w:i/>
       <w:iCs/>
-      <w:color w:themeColor="text1" w:themeTint="A6" w:val="595959"/>
-    </w:rPr>
-  </w:style>
-  <w:style w:customStyle="1" w:styleId="Heading7Char" w:type="character">
+      <w:color w:val="595959" w:themeColor="text1" w:themeTint="A6"/>
+    </w:rPr>
+  </w:style>
+  <w:style w:type="character" w:customStyle="1" w:styleId="Heading7Char">
     <w:name w:val="Heading 7 Char"/>
     <w:basedOn w:val="DefaultParagraphFont"/>
     <w:link w:val="Heading7"/>
@@ -1676,11 +1676,11 @@
     <w:semiHidden/>
     <w:rsid w:val="00A10FD9"/>
     <w:rPr>
-      <w:rFonts w:cstheme="majorBidi" w:eastAsiaTheme="majorEastAsia"/>
-      <w:color w:themeColor="text1" w:themeTint="A6" w:val="595959"/>
-    </w:rPr>
-  </w:style>
-  <w:style w:customStyle="1" w:styleId="Heading8Char" w:type="character">
+      <w:rFonts w:eastAsiaTheme="majorEastAsia" w:cstheme="majorBidi"/>
+      <w:color w:val="595959" w:themeColor="text1" w:themeTint="A6"/>
+    </w:rPr>
+  </w:style>
+  <w:style w:type="character" w:customStyle="1" w:styleId="Heading8Char">
     <w:name w:val="Heading 8 Char"/>
     <w:basedOn w:val="DefaultParagraphFont"/>
     <w:link w:val="Heading8"/>
@@ -1688,13 +1688,13 @@
     <w:semiHidden/>
     <w:rsid w:val="00A10FD9"/>
     <w:rPr>
-      <w:rFonts w:cstheme="majorBidi" w:eastAsiaTheme="majorEastAsia"/>
+      <w:rFonts w:eastAsiaTheme="majorEastAsia" w:cstheme="majorBidi"/>
       <w:i/>
       <w:iCs/>
-      <w:color w:themeColor="text1" w:themeTint="D8" w:val="272727"/>
-    </w:rPr>
-  </w:style>
-  <w:style w:customStyle="1" w:styleId="Heading9Char" w:type="character">
+      <w:color w:val="272727" w:themeColor="text1" w:themeTint="D8"/>
+    </w:rPr>
+  </w:style>
+  <w:style w:type="character" w:customStyle="1" w:styleId="Heading9Char">
     <w:name w:val="Heading 9 Char"/>
     <w:basedOn w:val="DefaultParagraphFont"/>
     <w:link w:val="Heading9"/>
@@ -1702,20 +1702,20 @@
     <w:semiHidden/>
     <w:rsid w:val="00A10FD9"/>
     <w:rPr>
-      <w:rFonts w:cstheme="majorBidi" w:eastAsiaTheme="majorEastAsia"/>
-      <w:color w:themeColor="text1" w:themeTint="D8" w:val="272727"/>
-    </w:rPr>
-  </w:style>
-  <w:style w:customStyle="1" w:styleId="ListItem" w:type="paragraph">
+      <w:rFonts w:eastAsiaTheme="majorEastAsia" w:cstheme="majorBidi"/>
+      <w:color w:val="272727" w:themeColor="text1" w:themeTint="D8"/>
+    </w:rPr>
+  </w:style>
+  <w:style w:type="paragraph" w:customStyle="1" w:styleId="ListItem">
     <w:name w:val="List Item"/>
     <w:basedOn w:val="BodyText"/>
     <w:qFormat/>
     <w:pPr>
-      <w:spacing w:after="0" w:before="0" w:line="480" w:lineRule="exact"/>
-      <w:ind w:hanging="720" w:left="720"/>
-    </w:pPr>
-  </w:style>
-  <w:style w:styleId="BlockText" w:type="paragraph">
+      <w:spacing w:before="0" w:after="0" w:line="480" w:lineRule="exact"/>
+      <w:ind w:left="720" w:hanging="720"/>
+    </w:pPr>
+  </w:style>
+  <w:style w:type="paragraph" w:styleId="BlockText">
     <w:name w:val="Block Text"/>
     <w:basedOn w:val="BodyText"/>
     <w:next w:val="BodyText"/>
@@ -1723,11 +1723,11 @@
     <w:unhideWhenUsed/>
     <w:qFormat/>
     <w:pPr>
-      <w:spacing w:after="280" w:before="280" w:line="240" w:lineRule="exact"/>
+      <w:spacing w:before="280" w:after="280" w:line="240" w:lineRule="exact"/>
       <w:ind w:firstLine="0" w:left="720" w:right="720"/>
     </w:pPr>
   </w:style>
-  <w:style w:styleId="FootnoteText" w:type="paragraph">
+  <w:style w:type="paragraph" w:styleId="FootnoteText">
     <w:name w:val="Footnote Text"/>
     <w:basedOn w:val="Normal"/>
     <w:next w:val="FootnoteText"/>
@@ -1736,14 +1736,14 @@
     <w:qFormat/>
     <w:pPr>
       <w:keepLines/>
-      <w:spacing w:after="140" w:before="0" w:line="240" w:lineRule="exact"/>
+      <w:spacing w:before="0" w:after="140" w:line="240" w:lineRule="exact"/>
     </w:pPr>
     <w:rPr>
       <w:sz w:val="24"/>
       <w:szCs w:val="24"/>
     </w:rPr>
   </w:style>
-  <w:style w:styleId="FootnoteBlockText" w:type="paragraph">
+  <w:style w:type="paragraph" w:styleId="FootnoteBlockText">
     <w:name w:val="Footnote Block Text"/>
     <w:basedOn w:val="FootnoteText"/>
     <w:next w:val="FootnoteText"/>
@@ -1751,38 +1751,29 @@
     <w:unhideWhenUsed/>
     <w:qFormat/>
     <w:pPr>
-      <w:spacing w:after="280" w:before="280"/>
+      <w:spacing w:before="280" w:after="280"/>
       <w:ind w:firstLine="0" w:left="720" w:right="720"/>
     </w:pPr>
   </w:style>
-  <w:style w:default="1" w:styleId="DefaultParagraphFont" w:type="character">
+  <w:style w:type="character" w:default="1" w:styleId="DefaultParagraphFont">
     <w:name w:val="Default Paragraph Font"/>
     <w:semiHidden/>
     <w:unhideWhenUsed/>
   </w:style>
-  <w:style w:default="1" w:styleId="Table" w:type="table">
+  <w:style w:type="table" w:default="1" w:styleId="Table">
     <w:name w:val="Table"/>
     <w:basedOn w:val="TableNormal"/>
-    <w:semiHidden/>
-    <w:unhideWhenUsed/>
     <w:qFormat/>
     <w:tblPr>
-      <w:tblInd w:type="dxa" w:w="0"/>
+      <w:tblInd w:w="0" w:type="dxa"/>
       <w:tblCellMar>
-        <w:top w:type="dxa" w:w="0"/>
-        <w:left w:type="dxa" w:w="108"/>
-        <w:bottom w:type="dxa" w:w="0"/>
-        <w:right w:type="dxa" w:w="108"/>
+        <w:top w:w="0" w:type="dxa"/>
+        <w:left w:w="108" w:type="dxa"/>
+        <w:bottom w:w="0" w:type="dxa"/>
+        <w:right w:w="108" w:type="dxa"/>
       </w:tblCellMar>
     </w:tblPr>
     <w:tblStylePr w:type="firstRow">
-      <w:tblPr>
-        <w:jc w:val="left"/>
-        <w:tblInd w:type="dxa" w:w="0"/>
-      </w:tblPr>
-      <w:trPr>
-        <w:jc w:val="left"/>
-      </w:trPr>
       <w:tcPr>
         <w:tcBorders>
           <w:bottom w:val="single"/>
@@ -1791,7 +1782,7 @@
       </w:tcPr>
     </w:tblStylePr>
   </w:style>
-  <w:style w:customStyle="1" w:styleId="DefinitionTerm" w:type="paragraph">
+  <w:style w:type="paragraph" w:customStyle="1" w:styleId="DefinitionTerm">
     <w:name w:val="Definition Term"/>
     <w:basedOn w:val="Normal"/>
     <w:next w:val="Definition"/>
@@ -1804,49 +1795,49 @@
       <w:b/>
     </w:rPr>
   </w:style>
-  <w:style w:customStyle="1" w:styleId="Definition" w:type="paragraph">
+  <w:style w:type="paragraph" w:customStyle="1" w:styleId="Definition">
     <w:name w:val="Definition"/>
     <w:basedOn w:val="Normal"/>
   </w:style>
-  <w:style w:styleId="Caption" w:type="paragraph">
+  <w:style w:type="paragraph" w:styleId="Caption">
     <w:name w:val="Caption"/>
     <w:basedOn w:val="Normal"/>
     <w:link w:val="BodyTextChar"/>
     <w:pPr>
-      <w:spacing w:after="120" w:before="0"/>
+      <w:spacing w:before="0" w:after="120"/>
     </w:pPr>
     <w:rPr>
       <w:i/>
     </w:rPr>
   </w:style>
-  <w:style w:customStyle="1" w:styleId="TableCaption" w:type="paragraph">
+  <w:style w:type="paragraph" w:customStyle="1" w:styleId="TableCaption">
     <w:name w:val="Table Caption"/>
     <w:basedOn w:val="Caption"/>
     <w:pPr>
       <w:keepNext/>
     </w:pPr>
   </w:style>
-  <w:style w:customStyle="1" w:styleId="ImageCaption" w:type="paragraph">
+  <w:style w:type="paragraph" w:customStyle="1" w:styleId="ImageCaption">
     <w:name w:val="Image Caption"/>
     <w:basedOn w:val="Caption"/>
   </w:style>
-  <w:style w:customStyle="1" w:styleId="Figure" w:type="paragraph">
+  <w:style w:type="paragraph" w:customStyle="1" w:styleId="Figure">
     <w:name w:val="Figure"/>
     <w:basedOn w:val="Normal"/>
   </w:style>
-  <w:style w:customStyle="1" w:styleId="CaptionedFigure" w:type="paragraph">
+  <w:style w:type="paragraph" w:customStyle="1" w:styleId="CaptionedFigure">
     <w:name w:val="Captioned Figure"/>
     <w:basedOn w:val="Figure"/>
     <w:pPr>
       <w:keepNext/>
     </w:pPr>
   </w:style>
-  <w:style w:customStyle="1" w:styleId="BodyTextChar" w:type="character">
+  <w:style w:type="character" w:customStyle="1" w:styleId="BodyTextChar">
     <w:name w:val="Body Text Char"/>
     <w:basedOn w:val="DefaultParagraphFont"/>
     <w:link w:val="BodyText"/>
   </w:style>
-  <w:style w:customStyle="1" w:styleId="VerbatimChar" w:type="character">
+  <w:style w:type="character" w:customStyle="1" w:styleId="VerbatimChar">
     <w:name w:val="Verbatim Char"/>
     <w:basedOn w:val="BodyTextChar"/>
     <w:rPr>
@@ -1854,25 +1845,25 @@
       <w:sz w:val="22"/>
     </w:rPr>
   </w:style>
-  <w:style w:customStyle="1" w:styleId="SectionNumber" w:type="character">
+  <w:style w:type="character" w:customStyle="1" w:styleId="SectionNumber">
     <w:name w:val="Section Number"/>
     <w:basedOn w:val="BodyTextChar"/>
   </w:style>
-  <w:style w:styleId="FootnoteReference" w:type="character">
+  <w:style w:type="character" w:styleId="FootnoteReference">
     <w:name w:val="Footnote Reference"/>
     <w:basedOn w:val="BodyTextChar"/>
     <w:rPr>
       <w:vertAlign w:val="superscript"/>
     </w:rPr>
   </w:style>
-  <w:style w:styleId="Hyperlink" w:type="character">
+  <w:style w:type="character" w:styleId="Hyperlink">
     <w:name w:val="Hyperlink"/>
     <w:basedOn w:val="BodyTextChar"/>
     <w:rPr>
       <w:color w:val="000000"/>
     </w:rPr>
   </w:style>
-  <w:style w:styleId="TOCHeading" w:type="paragraph">
+  <w:style w:type="paragraph" w:styleId="TOCHeading">
     <w:name w:val="TOC Heading"/>
     <w:basedOn w:val="Heading1"/>
     <w:next w:val="BodyText"/>
@@ -1884,10 +1875,10 @@
       <w:outlineLvl w:val="9"/>
     </w:pPr>
     <w:rPr>
-      <w:rFonts w:asciiTheme="majorHAnsi" w:cstheme="majorBidi" w:eastAsiaTheme="majorEastAsia" w:hAnsiTheme="majorHAnsi"/>
+      <w:rFonts w:asciiTheme="majorHAnsi" w:eastAsiaTheme="majorEastAsia" w:hAnsiTheme="majorHAnsi" w:cstheme="majorBidi"/>
       <w:b w:val="0"/>
       <w:bCs w:val="0"/>
-      <w:color w:themeColor="accent1" w:themeShade="BF" w:val="365F91"/>
+      <w:color w:val="365F91" w:themeColor="accent1" w:themeShade="BF"/>
     </w:rPr>
   </w:style>
   <w:style w:type="paragraph" w:customStyle="1" w:styleId="SourceCode">

</xml_diff>